<commit_message>
Update Abstract in MD and compile to DOCX v5.2
</commit_message>
<xml_diff>
--- a/Kashdan et al Draft v5.2.docx
+++ b/Kashdan et al Draft v5.2.docx
@@ -71,21 +71,7 @@
           <w:color w:val="444444"/>
           <w:sz w:val="20"/>
         </w:rPr>
-        <w:t>The western sector of the Canadian Arctic, including Herschel, Richards, and Pullen (North Head) islands and Liverpool Bay, contains both relict massive ground ice and moraine complexes formed near the grounding line of the ancient Beaufort Sea ice sheet. Direct radiocarbon ages (via ¹⁴C and CO₂ extraction) from these massive ice bodies range from 32,220 to 25,830 cal yr BP, placing their formation in MIS 3 and the MIS 3/2 transition (Wetterich et al., 2023). This extends the only previous constraint of 21,290 cal yr BP (MIS 2). On the same shelf, seismic profiles show moraine ridges interpreted as grounding-zone wedges (GZWs) — sediment accumulations deposited where grounded ice meets a floating shelf. In a warm-based regime, subglacial meltwater decreases effective pressure, causing rapid sliding that erodes and shears the bed. Under these conditions, meter-scale massive ice bodies would have been sheared and destroyed during the Late Pleistocene. Their survival on Herschel Island and adjacent coastlands indicates that the bed remained frozen and stable.</w:t>
-      </w:r>
-    </w:p>
-    <w:p>
-      <w:pPr>
-        <w:spacing w:after="240"/>
-        <w:ind w:left="576" w:right="576"/>
-      </w:pPr>
-      <w:r>
-        <w:rPr>
-          <w:rFonts w:ascii="Times New Roman" w:hAnsi="Times New Roman"/>
-          <w:color w:val="444444"/>
-          <w:sz w:val="20"/>
-        </w:rPr>
-        <w:t>We present a numerical model showing how a cold-based or transitional glacier can preserve massive ground ice while building GZWs. We show that the absence of MIS 2 GZWs in Mackenzie Bay is due to a lack of stabilization time during rapid ice retreat, comparing simulations for MIS 4 (long stillstands) and MIS 2 (rapid retreat).</w:t>
+        <w:t>The western Canadian Arctic, including Herschel, Richards, and Pullen (North Head) islands and Liverpool Bay, contains relict massive ground ice and moraine complexes associated with former ice-sheet grounding and shelf-margin processes. Direct radiocarbon age determinations from massive ice on Herschel Island range from 32,220 to 25,830 cal yr BP, placing formation in MIS 3 and the MIS 3/2 transition; this extends the previously only available direct age of 21,290 cal yr BP into the earlier Late Pleistocene. Seismic profiles on the same shelf show moraine ridges interpreted as grounding-zone wedges (GZWs), i.e. sediment accumulations formed where grounded ice met floating ice. Because warm-based conditions with active subglacial meltwater and high basal sliding would favor erosion and deformation, the preservation of meters-scale massive ice bodies on Herschel Island and adjacent coastlands suggests long-term frozen, stable bed conditions rather than sustained warm-based shearing. We present a numerical model showing how a cold-based or transitional glacier can preserve massive ground ice while building GZWs. We show that the absence of MIS 2 GZWs in Mackenzie Bay is due to a lack of stabilization time during rapid ice retreat, comparing simulations for MIS 4 (long stillstands) and MIS 2 (rapid retreat).</w:t>
       </w:r>
     </w:p>
     <w:p>

</xml_diff>